<commit_message>
Repeatable-process polish: README reframe, prose rationales, pinned deps, .env.example
</commit_message>
<xml_diff>
--- a/output/Friedkin_AI_Ops_Exercise_-_Data_2026-06-07/investor_brief.docx
+++ b/output/Friedkin_AI_Ops_Exercise_-_Data_2026-06-07/investor_brief.docx
@@ -98,7 +98,7 @@
                 <w:color w:val="000000"/>
                 <w:sz w:val="20"/>
               </w:rPr>
-              <w:t>15 Tier 1</w:t>
+              <w:t>5 Tier 1, 10 Tier 2</w:t>
             </w:r>
           </w:p>
         </w:tc>
@@ -275,7 +275,7 @@
           <w:color w:val="000000"/>
           <w:sz w:val="22"/>
         </w:rPr>
-        <w:t>Blue Water Autonomy. Builds fully autonomous, crewless surface vessels for long-endurance open-ocean missions, carrying modular payloads for logistics, surveillance, or munitions. They combine purpose-built 100-foot, ~100-ton hulls with i... It has raised $64.0M to date, most recently a Series A round (Aug 2025). Signals: +56% headcount growth (6mo), +168% web traffic growth (6mo), ~50 employees. Founder signal: Unicorn Experience, Prior Exit, Prior IPO, Serial Founder, Top University. Scores: Stage 100, Sector 100, Founder 100, Momentum 100.</w:t>
+        <w:t>Blue Water Autonomy builds fully autonomous, crewless surface vessels for long-endurance open-ocean missions, carrying modular payloads for logistics, surveillance, or munitions. Backed by $64.0M raised to date, most recently a Series A round in Aug 2025. Over the past six months, +56% headcount and +168% web traffic growth, on a base of ~50 employees. Founder credentials include Unicorn Experience, Prior Exit, Prior IPO, Serial Founder, and Top University. Qualification score 100/100 (Stage 100, Sector 100, Founder 100, Momentum 100).</w:t>
       </w:r>
     </w:p>
     <w:p>
@@ -438,7 +438,7 @@
           <w:color w:val="000000"/>
           <w:sz w:val="22"/>
         </w:rPr>
-        <w:t>Lyric. Is a pioneering supply chain technology company founded in 2022 that offers an enterprise-grade, composable platform called Lyric Studio. The platform enables enterprises to model, plan, and operate supply chains with... It has raised $66.5M to date, most recently a Series B round (Aug 2025). Signals: +47% headcount growth (6mo), +89% web traffic growth (6mo), ~304 employees. Founder signal: Prior Exit, Prior IPO, Serial Founder. Scores: Stage 100, Sector 100, Founder 90, Momentum 100.</w:t>
+        <w:t>Lyric is a pioneering supply chain technology company founded in 2022 that offers an enterprise-grade, composable platform called Lyric Studio. Backed by $66.5M raised to date, most recently a Series B round in Aug 2025. Over the past six months, +47% headcount and +89% web traffic growth, on a base of ~304 employees. Founder credentials include Prior Exit, Prior IPO, and Serial Founder. Qualification score 96/100 (Stage 100, Sector 100, Founder 90, Momentum 100).</w:t>
       </w:r>
     </w:p>
     <w:p>
@@ -601,7 +601,7 @@
           <w:color w:val="000000"/>
           <w:sz w:val="22"/>
         </w:rPr>
-        <w:t>Robust.AI. Develops AI-powered autonomous mobile robots (AMRs) designed with a human-centric approach to enhance collaboration between robots and people. Their flagship product, Carter, is a flexible, scalable warehouse automati... It has raised $42.5M to date, most recently a Series A round (Apr 2023). Signals: +15% headcount growth (6mo), +39% web traffic growth (6mo), ~76 employees. Founder signal: Prior Exit, Prior IPO, Serial Founder, Top University. Scores: Stage 100, Sector 100, Founder 100, Momentum 76.</w:t>
+        <w:t>Robust.AI develops AI-powered autonomous mobile robots (AMRs) designed with a human-centric approach to enhance collaboration between robots and people. Backed by $42.5M raised to date, most recently a Series A round in Apr 2023. Over the past six months, +15% headcount and +39% web traffic growth, on a base of ~76 employees. Founder credentials include Prior Exit, Prior IPO, Serial Founder, and Top University. Qualification score 93/100 (Stage 100, Sector 100, Founder 100, Momentum 76).</w:t>
       </w:r>
     </w:p>
     <w:p>
@@ -779,7 +779,7 @@
           <w:color w:val="000000"/>
           <w:sz w:val="22"/>
         </w:rPr>
-        <w:t>Augment. Provides Augie, an AI teammate that automates complex logistics tasks so operations teams can focus on decisions and customer relationships. The platform is a B2B SaaS logistics productivity solution that uses AI and... It has raised $110.0M to date, most recently a Series A round (Sep 2025). Signals: +39% headcount growth (6mo), -43% web traffic growth (6mo), ~157 employees. Founder signal: Unicorn Experience, Prior Exit, Prior IPO, Serial Founder, Top University. Scores: Stage 100, Sector 100, Founder 100, Momentum 70.</w:t>
+        <w:t>Augment provides Augie, an AI teammate that automates complex logistics tasks so operations teams can focus on decisions and customer relationships. Backed by $110.0M raised to date, most recently a Series A round in Sep 2025. Over the past six months, +39% headcount and -43% web traffic growth, on a base of ~157 employees. Founder credentials include Unicorn Experience, Prior Exit, Prior IPO, Serial Founder, and Top University. Qualification score 91/100 (Stage 100, Sector 100, Founder 100, Momentum 70).</w:t>
       </w:r>
     </w:p>
     <w:p>
@@ -942,7 +942,7 @@
           <w:color w:val="000000"/>
           <w:sz w:val="22"/>
         </w:rPr>
-        <w:t>JetZero. Develops blended-wing-body commercial aircraft that aim to substantially lower fuel consumption and carbon emissions for airlines, cargo operators, and military customers. The company is advancing the Z4 all-wing airc... It has raised $436.4M to date, most recently a Series B round (Jan 2026). Signals: +17% headcount growth (6mo), -25% web traffic growth (6mo), ~218 employees. Founder signal: Unicorn Experience, Prior Exit, Prior IPO, Serial Founder. Scores: Stage 100, Sector 100, Founder 97, Momentum 70.</w:t>
+        <w:t>JetZero develops blended-wing-body commercial aircraft that aim to substantially lower fuel consumption and carbon emissions for airlines, cargo operators, and military customers. Backed by $436.4M raised to date, most recently a Series B round in Jan 2026. Over the past six months, +17% headcount and -25% web traffic growth, on a base of ~218 employees. Founder credentials include Unicorn Experience, Prior Exit, Prior IPO, and Serial Founder. Qualification score 90/100 (Stage 100, Sector 100, Founder 97, Momentum 70).</w:t>
       </w:r>
     </w:p>
     <w:p>
@@ -1060,7 +1060,7 @@
           <w:color w:val="595959"/>
           <w:sz w:val="20"/>
         </w:rPr>
-        <w:t xml:space="preserve">   (Tier 1)</w:t>
+        <w:t xml:space="preserve">   (Tier 2)</w:t>
       </w:r>
     </w:p>
     <w:p>
@@ -1105,7 +1105,7 @@
           <w:color w:val="000000"/>
           <w:sz w:val="22"/>
         </w:rPr>
-        <w:t>Pallet. Provides an AI logistics workforce that automates repetitive back-office supply chain tasks to reduce manual order entry, document processing, and freight quoting. Its core product, CoPallet, uses AI models and comput... It has raised $48.0M to date, most recently a Series B round (May 2025). Signals: +25% headcount growth (6mo), +158% web traffic growth (6mo), ~129 employees. Founder signal: Unicorn Experience, Prior Exit, Prior IPO, Serial Founder, Top University. Scores: Stage 100, Sector 60, Founder 97, Momentum 88.</w:t>
+        <w:t>Pallet provides an AI logistics workforce that automates repetitive back-office supply chain tasks to reduce manual order entry, document processing, and freight quoting. Backed by $48.0M raised to date, most recently a Series B round in May 2025. Over the past six months, +25% headcount and +158% web traffic growth, on a base of ~129 employees. Founder credentials include Unicorn Experience, Prior Exit, Prior IPO, Serial Founder, and Top University. Qualification score 89/100 (Stage 100, Sector 60, Founder 97, Momentum 88).</w:t>
       </w:r>
     </w:p>
     <w:p>
@@ -1127,7 +1127,7 @@
           <w:color w:val="000000"/>
           <w:sz w:val="22"/>
         </w:rPr>
-        <w:t>Reach out now (Tier 1). ~13mo since last raise - likely approaching a new round; strong time to engage.</w:t>
+        <w:t>Schedule partner review (Tier 2). ~13mo since last raise - likely approaching a new round; strong time to engage.</w:t>
       </w:r>
     </w:p>
     <w:p>
@@ -1238,7 +1238,7 @@
           <w:color w:val="595959"/>
           <w:sz w:val="20"/>
         </w:rPr>
-        <w:t xml:space="preserve">   (Tier 1)</w:t>
+        <w:t xml:space="preserve">   (Tier 2)</w:t>
       </w:r>
     </w:p>
     <w:p>
@@ -1283,7 +1283,7 @@
           <w:color w:val="000000"/>
           <w:sz w:val="22"/>
         </w:rPr>
-        <w:t>Observable Space. Supplies the hardware and software organizations need to operate spacecraft and observe the cosmos. The company provides telescopes and core software architecture that support mission operations, data collection, and... It has raised $106.0M to date, most recently a Series A round (May 2026). Signals: +43% headcount growth (6mo), +220% web traffic growth (6mo), ~43 employees. Founder signal: Unicorn Experience, Prior Exit, Serial Founder, Top University. Scores: Stage 100, Sector 100, Founder 73, Momentum 100.</w:t>
+        <w:t>Observable Space supplies the hardware and software organizations need to operate spacecraft and observe the cosmos. Backed by $106.0M raised to date, most recently a Series A round in May 2026. Over the past six months, +43% headcount and +220% web traffic growth, on a base of ~43 employees. Founder credentials include Unicorn Experience, Prior Exit, Serial Founder, and Top University. Qualification score 89/100 (Stage 100, Sector 100, Founder 73, Momentum 100).</w:t>
       </w:r>
     </w:p>
     <w:p>
@@ -1305,7 +1305,7 @@
           <w:color w:val="000000"/>
           <w:sz w:val="22"/>
         </w:rPr>
-        <w:t>Reach out now (Tier 1). Raised ~0mo ago - build the relationship now, ahead of the next round.</w:t>
+        <w:t>Schedule partner review (Tier 2). Raised ~0mo ago - build the relationship now, ahead of the next round.</w:t>
       </w:r>
     </w:p>
     <w:p>
@@ -1401,7 +1401,7 @@
           <w:color w:val="595959"/>
           <w:sz w:val="20"/>
         </w:rPr>
-        <w:t xml:space="preserve">   (Tier 1)</w:t>
+        <w:t xml:space="preserve">   (Tier 2)</w:t>
       </w:r>
     </w:p>
     <w:p>
@@ -1446,7 +1446,7 @@
           <w:color w:val="000000"/>
           <w:sz w:val="22"/>
         </w:rPr>
-        <w:t>Portal Space Systems. Builds the Supernova, a payload-agnostic satellite bus that provides rapid, long-range maneuverability for spacecraft operators. The Supernova uses a novel solar-thermal propulsion system and high-delta-v architecture... It has raised $132.0M to date, most recently a Series A round (Apr 2026). Signals: +67% headcount growth (6mo), +76% web traffic growth (6mo), ~35 employees. Founder signal: Unicorn Experience, Serial Founder, Top University. Scores: Stage 100, Sector 100, Founder 67, Momentum 100.</w:t>
+        <w:t>Portal Space Systems builds the Supernova, a payload-agnostic satellite bus that provides rapid, long-range maneuverability for spacecraft operators. Backed by $132.0M raised to date, most recently a Series A round in Apr 2026. Over the past six months, +67% headcount and +76% web traffic growth, on a base of ~35 employees. Founder credentials include Unicorn Experience, Serial Founder, and Top University. Qualification score 87/100 (Stage 100, Sector 100, Founder 67, Momentum 100).</w:t>
       </w:r>
     </w:p>
     <w:p>
@@ -1468,7 +1468,7 @@
           <w:color w:val="000000"/>
           <w:sz w:val="22"/>
         </w:rPr>
-        <w:t>Reach out now (Tier 1). Raised ~2mo ago - build the relationship now, ahead of the next round.</w:t>
+        <w:t>Schedule partner review (Tier 2). Raised ~2mo ago - build the relationship now, ahead of the next round.</w:t>
       </w:r>
     </w:p>
     <w:p>
@@ -1564,7 +1564,7 @@
           <w:color w:val="595959"/>
           <w:sz w:val="20"/>
         </w:rPr>
-        <w:t xml:space="preserve">   (Tier 1)</w:t>
+        <w:t xml:space="preserve">   (Tier 2)</w:t>
       </w:r>
     </w:p>
     <w:p>
@@ -1609,7 +1609,7 @@
           <w:color w:val="000000"/>
           <w:sz w:val="22"/>
         </w:rPr>
-        <w:t>Quantum Space. Is building the maneuver-first space infrastructure required for today's contested domain. Their flagship platform, Ranger, enables dynamic, persistent capabilities supporting national security and commercial missions... It has raised $73.2M to date, most recently a Series A round (Jun 2025). Signals: +44% headcount growth (6mo), -82% web traffic growth (6mo), ~69 employees. Founder signal: Unicorn Experience, Prior Exit, Prior IPO, Serial Founder, Top University. Scores: Stage 100, Sector 100, Founder 100, Momentum 58.</w:t>
+        <w:t>Quantum Space is building the maneuver-first space infrastructure required for today's contested domain. Their flagship platform, Ranger, enables dynamic, persistent capabilities supporting national security and. Backed by $73.2M raised to date, most recently a Series A round in Jun 2025. Over the past six months, +44% headcount and -82% web traffic growth, on a base of ~69 employees. Founder credentials include Unicorn Experience, Prior Exit, Prior IPO, Serial Founder, and Top University. Qualification score 87/100 (Stage 100, Sector 100, Founder 100, Momentum 58).</w:t>
       </w:r>
     </w:p>
     <w:p>
@@ -1631,7 +1631,7 @@
           <w:color w:val="000000"/>
           <w:sz w:val="22"/>
         </w:rPr>
-        <w:t>Reach out now (Tier 1). ~12mo since last raise - likely approaching a new round; strong time to engage.</w:t>
+        <w:t>Schedule partner review (Tier 2). ~12mo since last raise - likely approaching a new round; strong time to engage.</w:t>
       </w:r>
     </w:p>
     <w:p>
@@ -1742,7 +1742,7 @@
           <w:color w:val="595959"/>
           <w:sz w:val="20"/>
         </w:rPr>
-        <w:t xml:space="preserve">   (Tier 1)</w:t>
+        <w:t xml:space="preserve">   (Tier 2)</w:t>
       </w:r>
     </w:p>
     <w:p>
@@ -1787,7 +1787,7 @@
           <w:color w:val="000000"/>
           <w:sz w:val="22"/>
         </w:rPr>
-        <w:t>ATMOS Space Cargo. Provides predictable, low-stress return of payloads from orbit to Earth for research, manufacturing, and defense customers. It builds the PHOENIX return capsule using an inflatable heat shield for cost-efficient atmos... It has raised $50.9M to date, most recently a Series A round (Apr 2026). Signals: +29% headcount growth (6mo), +434% web traffic growth (6mo), ~80 employees. Founder signal: Prior Exit, Serial Founder, Top University. Scores: Stage 100, Sector 100, Founder 67, Momentum 100.</w:t>
+        <w:t>ATMOS Space Cargo provides predictable, low-stress return of payloads from orbit to Earth for research, manufacturing, and defense customers. Backed by $50.9M raised to date, most recently a Series A round in Apr 2026. Over the past six months, +29% headcount and +434% web traffic growth, on a base of ~80 employees. Founder credentials include Prior Exit, Serial Founder, and Top University. Qualification score 87/100 (Stage 100, Sector 100, Founder 67, Momentum 100).</w:t>
       </w:r>
     </w:p>
     <w:p>
@@ -1809,7 +1809,7 @@
           <w:color w:val="000000"/>
           <w:sz w:val="22"/>
         </w:rPr>
-        <w:t>Reach out now (Tier 1). Raised ~2mo ago - build the relationship now, ahead of the next round.</w:t>
+        <w:t>Schedule partner review (Tier 2). Raised ~2mo ago - build the relationship now, ahead of the next round.</w:t>
       </w:r>
     </w:p>
     <w:p>
@@ -1905,7 +1905,7 @@
           <w:color w:val="595959"/>
           <w:sz w:val="20"/>
         </w:rPr>
-        <w:t xml:space="preserve">   (Tier 1)</w:t>
+        <w:t xml:space="preserve">   (Tier 2)</w:t>
       </w:r>
     </w:p>
     <w:p>
@@ -1950,7 +1950,7 @@
           <w:color w:val="000000"/>
           <w:sz w:val="22"/>
         </w:rPr>
-        <w:t>Reveni. Is a fintech platform that centralizes global sales, returns, and logistics for ecommerce businesses into a single dashboard, integrating with major ecommerce platforms. It automates returns and exchanges with instant... It has raised $18.2M to date, most recently a Series A round (Sep 2025). Signals: +36% headcount growth (6mo), +381% web traffic growth (6mo), ~53 employees. Founder signal: Unicorn Experience, Prior Exit, Serial Founder. Scores: Stage 100, Sector 60, Founder 77, Momentum 100.</w:t>
+        <w:t>Reveni is a fintech platform that centralizes global sales, returns, and logistics for ecommerce businesses into a single dashboard, integrating with major ecommerce platforms. Backed by $18.2M raised to date, most recently a Series A round in Sep 2025. Over the past six months, +36% headcount and +381% web traffic growth, on a base of ~53 employees. Founder credentials include Unicorn Experience, Prior Exit, and Serial Founder. Qualification score 85/100 (Stage 100, Sector 60, Founder 77, Momentum 100).</w:t>
       </w:r>
     </w:p>
     <w:p>
@@ -1972,7 +1972,7 @@
           <w:color w:val="000000"/>
           <w:sz w:val="22"/>
         </w:rPr>
-        <w:t>Reach out now (Tier 1). Raised ~8mo ago - build the relationship now, ahead of the next round.</w:t>
+        <w:t>Schedule partner review (Tier 2). Raised ~8mo ago - build the relationship now, ahead of the next round.</w:t>
       </w:r>
     </w:p>
     <w:p>
@@ -2083,7 +2083,7 @@
           <w:color w:val="595959"/>
           <w:sz w:val="20"/>
         </w:rPr>
-        <w:t xml:space="preserve">   (Tier 1)</w:t>
+        <w:t xml:space="preserve">   (Tier 2)</w:t>
       </w:r>
     </w:p>
     <w:p>
@@ -2128,7 +2128,7 @@
           <w:color w:val="000000"/>
           <w:sz w:val="22"/>
         </w:rPr>
-        <w:t>Waylens Inc.. Waylens provides an AI video platform that helps fleet operators detect incidents, reduce risk, and manage driver safety. The company combines on-vehicle smart cameras and hardware with onboard AI models, data workflo... It has raised $6.8M to date, most recently a Series A round (Jun 2017). Signals: +28% headcount growth (6mo), -29% web traffic growth (6mo), ~23 employees. Founder signal: Unicorn Experience, Prior Exit, Prior IPO, Serial Founder, Top University. Scores: Stage 100, Sector 100, Founder 100, Momentum 46.</w:t>
+        <w:t>Waylens Inc.: Waylens provides an AI video platform that helps fleet operators detect incidents, reduce risk, and manage driver safety. Backed by $6.8M raised to date, most recently a Series A round in Jun 2017. Over the past six months, +28% headcount and -29% web traffic growth, on a base of ~23 employees. Founder credentials include Unicorn Experience, Prior Exit, Prior IPO, Serial Founder, and Top University. Qualification score 84/100 (Stage 100, Sector 100, Founder 100, Momentum 46).</w:t>
       </w:r>
     </w:p>
     <w:p>
@@ -2276,7 +2276,7 @@
           <w:color w:val="595959"/>
           <w:sz w:val="20"/>
         </w:rPr>
-        <w:t xml:space="preserve">   (Tier 1)</w:t>
+        <w:t xml:space="preserve">   (Tier 2)</w:t>
       </w:r>
     </w:p>
     <w:p>
@@ -2321,7 +2321,7 @@
           <w:color w:val="000000"/>
           <w:sz w:val="22"/>
         </w:rPr>
-        <w:t>Filics. Provides an innovative automated double runner system, the Filics Unit, for efficient pallet transportation in intralogistics, addressing labor shortages and increasing productivity. This compact, autonomously guided... It has raised $15.9M to date, most recently a Series A round (Jul 2025). Signals: +100% headcount growth (6mo), +457% web traffic growth (6mo), ~52 employees. Founder signal: Unicorn Experience, Serial Founder, Top University. Scores: Stage 100, Sector 100, Founder 57, Momentum 100.</w:t>
+        <w:t>Filics provides an innovative automated double runner system, the Filics Unit, for efficient pallet transportation in intralogistics, addressing labor shortages and increasing productivity. Backed by $15.9M raised to date, most recently a Series A round in Jul 2025. Over the past six months, +100% headcount and +457% web traffic growth, on a base of ~52 employees. Founder credentials include Unicorn Experience, Serial Founder, and Top University. Qualification score 83/100 (Stage 100, Sector 100, Founder 57, Momentum 100).</w:t>
       </w:r>
     </w:p>
     <w:p>
@@ -2439,7 +2439,7 @@
           <w:color w:val="595959"/>
           <w:sz w:val="20"/>
         </w:rPr>
-        <w:t xml:space="preserve">   (Tier 1)</w:t>
+        <w:t xml:space="preserve">   (Tier 2)</w:t>
       </w:r>
     </w:p>
     <w:p>
@@ -2484,7 +2484,7 @@
           <w:color w:val="000000"/>
           <w:sz w:val="22"/>
         </w:rPr>
-        <w:t>Swarm Aero. Enables small teams to deploy and coordinate thousands of uncrewed vehicles in communications-limited, contested environments. It does this with a Universal Swarm Node that provides a sensor mesh, edge computing, and... It has raised $35.0M to date, most recently a Series A round (Mar 2026). Signals: +51% headcount growth (6mo), ~68 employees. Founder signal: Unicorn Experience, Prior Exit, Serial Founder, Top University. Scores: Stage 100, Sector 100, Founder 80, Momentum 70.</w:t>
+        <w:t>Swarm Aero enables small teams to deploy and coordinate thousands of uncrewed vehicles in communications-limited, contested environments. Backed by $35.0M raised to date, most recently a Series A round in Mar 2026. Over the past six months, +51% headcount growth, on a base of ~68 employees. Founder credentials include Unicorn Experience, Prior Exit, Serial Founder, and Top University. Qualification score 83/100 (Stage 100, Sector 100, Founder 80, Momentum 70).</w:t>
       </w:r>
     </w:p>
     <w:p>
@@ -2617,7 +2617,7 @@
           <w:color w:val="595959"/>
           <w:sz w:val="20"/>
         </w:rPr>
-        <w:t xml:space="preserve">   (Tier 1)</w:t>
+        <w:t xml:space="preserve">   (Tier 2)</w:t>
       </w:r>
     </w:p>
     <w:p>
@@ -2662,7 +2662,7 @@
           <w:color w:val="000000"/>
           <w:sz w:val="22"/>
         </w:rPr>
-        <w:t>Reflex Aerospace. Specializes in designing and building custom satellite platforms at scale, quickly. Leveraging advanced manufacturing and design processes, they significantly reduce lead times, delivering high-performance satellite s... It has raised $68.7M to date, most recently a Series A round (Nov 2025). Signals: +51% headcount growth (6mo), -12% web traffic growth (6mo), ~106 employees. Founder signal: Prior Exit, Prior IPO, Serial Founder. Scores: Stage 100, Sector 100, Founder 80, Momentum 70.</w:t>
+        <w:t>Reflex Aerospace specializes in designing and building custom satellite platforms at scale, quickly. Leveraging advanced manufacturing and design processes, they significantly reduce lead times, delivering. Backed by $68.7M raised to date, most recently a Series A round in Nov 2025. Over the past six months, +51% headcount and -12% web traffic growth, on a base of ~106 employees. Founder credentials include Prior Exit, Prior IPO, and Serial Founder. Qualification score 83/100 (Stage 100, Sector 100, Founder 80, Momentum 70).</w:t>
       </w:r>
     </w:p>
     <w:p>

</xml_diff>